<commit_message>
add emotion/stress/diction performance notes to character dialogue doc
Co-Authored-By: Claude Sonnet 5 <noreply@anthropic.com>
Claude-Session: https://claude.ai/code/session_01DJ4QExYcWv1sV4K1idohb4
</commit_message>
<xml_diff>
--- a/07-自动化流程-小豆芽/美伢的两本账_角色台词.docx
+++ b/07-自动化流程-小豆芽/美伢的两本账_角色台词.docx
@@ -14,7 +14,7 @@
           <w:sz w:val="44"/>
           <w:szCs w:val="44"/>
         </w:rPr>
-        <w:t xml:space="preserve">《美伢的两本账》角色台词</w:t>
+        <w:t xml:space="preserve">《美伢的两本账》角色台词（含演绎提示）</w:t>
       </w:r>
     </w:p>
     <w:p>
@@ -51,7 +51,7 @@
     </w:p>
     <w:p>
       <w:pPr>
-        <w:spacing w:after="60"/>
+        <w:spacing w:after="60" w:before="200"/>
       </w:pPr>
       <w:r>
         <w:rPr>
@@ -75,7 +75,7 @@
     </w:p>
     <w:p>
       <w:pPr>
-        <w:spacing w:after="280"/>
+        <w:spacing w:after="80"/>
         <w:ind w:left="360"/>
       </w:pPr>
       <w:r>
@@ -88,7 +88,79 @@
     </w:p>
     <w:p>
       <w:pPr>
-        <w:spacing w:after="60"/>
+        <w:spacing w:after="40"/>
+        <w:ind w:left="360"/>
+      </w:pPr>
+      <w:r>
+        <w:rPr>
+          <w:b/>
+          <w:bCs/>
+          <w:color w:val="B05A00"/>
+          <w:sz w:val="21"/>
+          <w:szCs w:val="21"/>
+        </w:rPr>
+        <w:t xml:space="preserve">情绪基调：</w:t>
+      </w:r>
+      <w:r>
+        <w:rPr>
+          <w:color w:val="B05A00"/>
+          <w:sz w:val="21"/>
+          <w:szCs w:val="21"/>
+        </w:rPr>
+        <w:t xml:space="preserve">淡定从容，完全不受爸爸情绪影响，带一点'胸有成竹'的自信</w:t>
+      </w:r>
+    </w:p>
+    <w:p>
+      <w:pPr>
+        <w:spacing w:after="40"/>
+        <w:ind w:left="360"/>
+      </w:pPr>
+      <w:r>
+        <w:rPr>
+          <w:b/>
+          <w:bCs/>
+          <w:color w:val="1F5FA8"/>
+          <w:sz w:val="21"/>
+          <w:szCs w:val="21"/>
+        </w:rPr>
+        <w:t xml:space="preserve">重音词：</w:t>
+      </w:r>
+      <w:r>
+        <w:rPr>
+          <w:color w:val="1F5FA8"/>
+          <w:sz w:val="21"/>
+          <w:szCs w:val="21"/>
+        </w:rPr>
+        <w:t xml:space="preserve">反过来</w:t>
+      </w:r>
+    </w:p>
+    <w:p>
+      <w:pPr>
+        <w:spacing w:after="280"/>
+        <w:ind w:left="360"/>
+      </w:pPr>
+      <w:r>
+        <w:rPr>
+          <w:b/>
+          <w:bCs/>
+          <w:color w:val="1E7A46"/>
+          <w:sz w:val="21"/>
+          <w:szCs w:val="21"/>
+        </w:rPr>
+        <w:t xml:space="preserve">咬字/节奏提示：</w:t>
+      </w:r>
+      <w:r>
+        <w:rPr>
+          <w:color w:val="1E7A46"/>
+          <w:sz w:val="21"/>
+          <w:szCs w:val="21"/>
+        </w:rPr>
+        <w:t xml:space="preserve">语速平稳不急躁，“反过来”三字咬清楚、可略拖长，是全片悬念钩子</w:t>
+      </w:r>
+    </w:p>
+    <w:p>
+      <w:pPr>
+        <w:spacing w:after="60" w:before="200"/>
       </w:pPr>
       <w:r>
         <w:rPr>
@@ -112,7 +184,7 @@
     </w:p>
     <w:p>
       <w:pPr>
-        <w:spacing w:after="280"/>
+        <w:spacing w:after="80"/>
         <w:ind w:left="360"/>
       </w:pPr>
       <w:r>
@@ -125,7 +197,79 @@
     </w:p>
     <w:p>
       <w:pPr>
-        <w:spacing w:after="60"/>
+        <w:spacing w:after="40"/>
+        <w:ind w:left="360"/>
+      </w:pPr>
+      <w:r>
+        <w:rPr>
+          <w:b/>
+          <w:bCs/>
+          <w:color w:val="B05A00"/>
+          <w:sz w:val="21"/>
+          <w:szCs w:val="21"/>
+        </w:rPr>
+        <w:t xml:space="preserve">情绪基调：</w:t>
+      </w:r>
+      <w:r>
+        <w:rPr>
+          <w:color w:val="B05A00"/>
+          <w:sz w:val="21"/>
+          <w:szCs w:val="21"/>
+        </w:rPr>
+        <w:t xml:space="preserve">耐心讲解，语气温和但逻辑清晰</w:t>
+      </w:r>
+    </w:p>
+    <w:p>
+      <w:pPr>
+        <w:spacing w:after="40"/>
+        <w:ind w:left="360"/>
+      </w:pPr>
+      <w:r>
+        <w:rPr>
+          <w:b/>
+          <w:bCs/>
+          <w:color w:val="1F5FA8"/>
+          <w:sz w:val="21"/>
+          <w:szCs w:val="21"/>
+        </w:rPr>
+        <w:t xml:space="preserve">重音词：</w:t>
+      </w:r>
+      <w:r>
+        <w:rPr>
+          <w:color w:val="1F5FA8"/>
+          <w:sz w:val="21"/>
+          <w:szCs w:val="21"/>
+        </w:rPr>
+        <w:t xml:space="preserve">三成 / 说得上话 / 说了不算全部</w:t>
+      </w:r>
+    </w:p>
+    <w:p>
+      <w:pPr>
+        <w:spacing w:after="280"/>
+        <w:ind w:left="360"/>
+      </w:pPr>
+      <w:r>
+        <w:rPr>
+          <w:b/>
+          <w:bCs/>
+          <w:color w:val="1E7A46"/>
+          <w:sz w:val="21"/>
+          <w:szCs w:val="21"/>
+        </w:rPr>
+        <w:t xml:space="preserve">咬字/节奏提示：</w:t>
+      </w:r>
+      <w:r>
+        <w:rPr>
+          <w:color w:val="1E7A46"/>
+          <w:sz w:val="21"/>
+          <w:szCs w:val="21"/>
+        </w:rPr>
+        <w:t xml:space="preserve">“说得上话”和“说了不算全部”之间加小停顿，用语气做出对比</w:t>
+      </w:r>
+    </w:p>
+    <w:p>
+      <w:pPr>
+        <w:spacing w:after="60" w:before="200"/>
       </w:pPr>
       <w:r>
         <w:rPr>
@@ -149,7 +293,7 @@
     </w:p>
     <w:p>
       <w:pPr>
-        <w:spacing w:after="280"/>
+        <w:spacing w:after="80"/>
         <w:ind w:left="360"/>
       </w:pPr>
       <w:r>
@@ -162,7 +306,79 @@
     </w:p>
     <w:p>
       <w:pPr>
-        <w:spacing w:after="60"/>
+        <w:spacing w:after="40"/>
+        <w:ind w:left="360"/>
+      </w:pPr>
+      <w:r>
+        <w:rPr>
+          <w:b/>
+          <w:bCs/>
+          <w:color w:val="B05A00"/>
+          <w:sz w:val="21"/>
+          <w:szCs w:val="21"/>
+        </w:rPr>
+        <w:t xml:space="preserve">情绪基调：</w:t>
+      </w:r>
+      <w:r>
+        <w:rPr>
+          <w:color w:val="B05A00"/>
+          <w:sz w:val="21"/>
+          <w:szCs w:val="21"/>
+        </w:rPr>
+        <w:t xml:space="preserve">肯定笃定，像在讲一条铁律</w:t>
+      </w:r>
+    </w:p>
+    <w:p>
+      <w:pPr>
+        <w:spacing w:after="40"/>
+        <w:ind w:left="360"/>
+      </w:pPr>
+      <w:r>
+        <w:rPr>
+          <w:b/>
+          <w:bCs/>
+          <w:color w:val="1F5FA8"/>
+          <w:sz w:val="21"/>
+          <w:szCs w:val="21"/>
+        </w:rPr>
+        <w:t xml:space="preserve">重音词：</w:t>
+      </w:r>
+      <w:r>
+        <w:rPr>
+          <w:color w:val="1F5FA8"/>
+          <w:sz w:val="21"/>
+          <w:szCs w:val="21"/>
+        </w:rPr>
+        <w:t xml:space="preserve">参与 / 应得的份额 / 不管有没有分给我</w:t>
+      </w:r>
+    </w:p>
+    <w:p>
+      <w:pPr>
+        <w:spacing w:after="280"/>
+        <w:ind w:left="360"/>
+      </w:pPr>
+      <w:r>
+        <w:rPr>
+          <w:b/>
+          <w:bCs/>
+          <w:color w:val="1E7A46"/>
+          <w:sz w:val="21"/>
+          <w:szCs w:val="21"/>
+        </w:rPr>
+        <w:t xml:space="preserve">咬字/节奏提示：</w:t>
+      </w:r>
+      <w:r>
+        <w:rPr>
+          <w:color w:val="1E7A46"/>
+          <w:sz w:val="21"/>
+          <w:szCs w:val="21"/>
+        </w:rPr>
+        <w:t xml:space="preserve">“参与”二字重读并略拖长，是全集核心概念词；语速比平时稍慢，方便观众消化逻辑</w:t>
+      </w:r>
+    </w:p>
+    <w:p>
+      <w:pPr>
+        <w:spacing w:after="60" w:before="200"/>
       </w:pPr>
       <w:r>
         <w:rPr>
@@ -186,7 +402,7 @@
     </w:p>
     <w:p>
       <w:pPr>
-        <w:spacing w:after="280"/>
+        <w:spacing w:after="80"/>
         <w:ind w:left="360"/>
       </w:pPr>
       <w:r>
@@ -199,7 +415,79 @@
     </w:p>
     <w:p>
       <w:pPr>
-        <w:spacing w:after="60"/>
+        <w:spacing w:after="40"/>
+        <w:ind w:left="360"/>
+      </w:pPr>
+      <w:r>
+        <w:rPr>
+          <w:b/>
+          <w:bCs/>
+          <w:color w:val="B05A00"/>
+          <w:sz w:val="21"/>
+          <w:szCs w:val="21"/>
+        </w:rPr>
+        <w:t xml:space="preserve">情绪基调：</w:t>
+      </w:r>
+      <w:r>
+        <w:rPr>
+          <w:color w:val="B05A00"/>
+          <w:sz w:val="21"/>
+          <w:szCs w:val="21"/>
+        </w:rPr>
+        <w:t xml:space="preserve">轻松举重若轻，带“这有什么好急的”的松弛感</w:t>
+      </w:r>
+    </w:p>
+    <w:p>
+      <w:pPr>
+        <w:spacing w:after="40"/>
+        <w:ind w:left="360"/>
+      </w:pPr>
+      <w:r>
+        <w:rPr>
+          <w:b/>
+          <w:bCs/>
+          <w:color w:val="1F5FA8"/>
+          <w:sz w:val="21"/>
+          <w:szCs w:val="21"/>
+        </w:rPr>
+        <w:t xml:space="preserve">重音词：</w:t>
+      </w:r>
+      <w:r>
+        <w:rPr>
+          <w:color w:val="1F5FA8"/>
+          <w:sz w:val="21"/>
+          <w:szCs w:val="21"/>
+        </w:rPr>
+        <w:t xml:space="preserve">全资 / 一个人说了算 / 左手倒右手 / 分红 / 才算数</w:t>
+      </w:r>
+    </w:p>
+    <w:p>
+      <w:pPr>
+        <w:spacing w:after="280"/>
+        <w:ind w:left="360"/>
+      </w:pPr>
+      <w:r>
+        <w:rPr>
+          <w:b/>
+          <w:bCs/>
+          <w:color w:val="1E7A46"/>
+          <w:sz w:val="21"/>
+          <w:szCs w:val="21"/>
+        </w:rPr>
+        <w:t xml:space="preserve">咬字/节奏提示：</w:t>
+      </w:r>
+      <w:r>
+        <w:rPr>
+          <w:color w:val="1E7A46"/>
+          <w:sz w:val="21"/>
+          <w:szCs w:val="21"/>
+        </w:rPr>
+        <w:t xml:space="preserve">句子长，建议在“急什么记？”后面换气停顿一拍，制造节奏感；“左手倒右手”可以带点自嘲笑意</w:t>
+      </w:r>
+    </w:p>
+    <w:p>
+      <w:pPr>
+        <w:spacing w:after="60" w:before="200"/>
       </w:pPr>
       <w:r>
         <w:rPr>
@@ -223,7 +511,7 @@
     </w:p>
     <w:p>
       <w:pPr>
-        <w:spacing w:after="280"/>
+        <w:spacing w:after="80"/>
         <w:ind w:left="360"/>
       </w:pPr>
       <w:r>
@@ -236,7 +524,79 @@
     </w:p>
     <w:p>
       <w:pPr>
-        <w:spacing w:after="60"/>
+        <w:spacing w:after="40"/>
+        <w:ind w:left="360"/>
+      </w:pPr>
+      <w:r>
+        <w:rPr>
+          <w:b/>
+          <w:bCs/>
+          <w:color w:val="B05A00"/>
+          <w:sz w:val="21"/>
+          <w:szCs w:val="21"/>
+        </w:rPr>
+        <w:t xml:space="preserve">情绪基调：</w:t>
+      </w:r>
+      <w:r>
+        <w:rPr>
+          <w:color w:val="B05A00"/>
+          <w:sz w:val="21"/>
+          <w:szCs w:val="21"/>
+        </w:rPr>
+        <w:t xml:space="preserve">宠溺调侃，带笑意</w:t>
+      </w:r>
+    </w:p>
+    <w:p>
+      <w:pPr>
+        <w:spacing w:after="40"/>
+        <w:ind w:left="360"/>
+      </w:pPr>
+      <w:r>
+        <w:rPr>
+          <w:b/>
+          <w:bCs/>
+          <w:color w:val="1F5FA8"/>
+          <w:sz w:val="21"/>
+          <w:szCs w:val="21"/>
+        </w:rPr>
+        <w:t xml:space="preserve">重音词：</w:t>
+      </w:r>
+      <w:r>
+        <w:rPr>
+          <w:color w:val="1F5FA8"/>
+          <w:sz w:val="21"/>
+          <w:szCs w:val="21"/>
+        </w:rPr>
+        <w:t xml:space="preserve">比你爸爸还懂账</w:t>
+      </w:r>
+    </w:p>
+    <w:p>
+      <w:pPr>
+        <w:spacing w:after="280"/>
+        <w:ind w:left="360"/>
+      </w:pPr>
+      <w:r>
+        <w:rPr>
+          <w:b/>
+          <w:bCs/>
+          <w:color w:val="1E7A46"/>
+          <w:sz w:val="21"/>
+          <w:szCs w:val="21"/>
+        </w:rPr>
+        <w:t xml:space="preserve">咬字/节奏提示：</w:t>
+      </w:r>
+      <w:r>
+        <w:rPr>
+          <w:color w:val="1E7A46"/>
+          <w:sz w:val="21"/>
+          <w:szCs w:val="21"/>
+        </w:rPr>
+        <w:t xml:space="preserve">尾音上扬带调侃语气，语速放慢一点，突出宠溺感</w:t>
+      </w:r>
+    </w:p>
+    <w:p>
+      <w:pPr>
+        <w:spacing w:after="60" w:before="200"/>
       </w:pPr>
       <w:r>
         <w:rPr>
@@ -260,7 +620,7 @@
     </w:p>
     <w:p>
       <w:pPr>
-        <w:spacing w:after="280"/>
+        <w:spacing w:after="80"/>
         <w:ind w:left="360"/>
       </w:pPr>
       <w:r>
@@ -273,6 +633,78 @@
     </w:p>
     <w:p>
       <w:pPr>
+        <w:spacing w:after="40"/>
+        <w:ind w:left="360"/>
+      </w:pPr>
+      <w:r>
+        <w:rPr>
+          <w:b/>
+          <w:bCs/>
+          <w:color w:val="B05A00"/>
+          <w:sz w:val="21"/>
+          <w:szCs w:val="21"/>
+        </w:rPr>
+        <w:t xml:space="preserve">情绪基调：</w:t>
+      </w:r>
+      <w:r>
+        <w:rPr>
+          <w:color w:val="B05A00"/>
+          <w:sz w:val="21"/>
+          <w:szCs w:val="21"/>
+        </w:rPr>
+        <w:t xml:space="preserve">从轻松转为若有所思，带一丝意外</w:t>
+      </w:r>
+    </w:p>
+    <w:p>
+      <w:pPr>
+        <w:spacing w:after="40"/>
+        <w:ind w:left="360"/>
+      </w:pPr>
+      <w:r>
+        <w:rPr>
+          <w:b/>
+          <w:bCs/>
+          <w:color w:val="1F5FA8"/>
+          <w:sz w:val="21"/>
+          <w:szCs w:val="21"/>
+        </w:rPr>
+        <w:t xml:space="preserve">重音词：</w:t>
+      </w:r>
+      <w:r>
+        <w:rPr>
+          <w:color w:val="1F5FA8"/>
+          <w:sz w:val="21"/>
+          <w:szCs w:val="21"/>
+        </w:rPr>
+        <w:t xml:space="preserve">拉别人入股 / 几个股东一起商量</w:t>
+      </w:r>
+    </w:p>
+    <w:p>
+      <w:pPr>
+        <w:spacing w:after="280"/>
+        <w:ind w:left="360"/>
+      </w:pPr>
+      <w:r>
+        <w:rPr>
+          <w:b/>
+          <w:bCs/>
+          <w:color w:val="1E7A46"/>
+          <w:sz w:val="21"/>
+          <w:szCs w:val="21"/>
+        </w:rPr>
+        <w:t xml:space="preserve">咬字/节奏提示：</w:t>
+      </w:r>
+      <w:r>
+        <w:rPr>
+          <w:color w:val="1E7A46"/>
+          <w:sz w:val="21"/>
+          <w:szCs w:val="21"/>
+        </w:rPr>
+        <w:t xml:space="preserve">“便当店阿姨说……”这里可以有明显停顿，制造悬念感；后半句语速放慢、咬字清楚，这是下集伏笔的关键信息</w:t>
+      </w:r>
+    </w:p>
+    <w:p>
+      <w:pPr>
         <w:pStyle w:val="Heading1"/>
         <w:spacing w:after="200" w:before="400"/>
       </w:pPr>
@@ -288,7 +720,7 @@
     </w:p>
     <w:p>
       <w:pPr>
-        <w:spacing w:after="60"/>
+        <w:spacing w:after="60" w:before="200"/>
       </w:pPr>
       <w:r>
         <w:rPr>
@@ -312,7 +744,7 @@
     </w:p>
     <w:p>
       <w:pPr>
-        <w:spacing w:after="280"/>
+        <w:spacing w:after="80"/>
         <w:ind w:left="360"/>
       </w:pPr>
       <w:r>
@@ -325,7 +757,79 @@
     </w:p>
     <w:p>
       <w:pPr>
-        <w:spacing w:after="60"/>
+        <w:spacing w:after="40"/>
+        <w:ind w:left="360"/>
+      </w:pPr>
+      <w:r>
+        <w:rPr>
+          <w:b/>
+          <w:bCs/>
+          <w:color w:val="B05A00"/>
+          <w:sz w:val="21"/>
+          <w:szCs w:val="21"/>
+        </w:rPr>
+        <w:t xml:space="preserve">情绪基调：</w:t>
+      </w:r>
+      <w:r>
+        <w:rPr>
+          <w:color w:val="B05A00"/>
+          <w:sz w:val="21"/>
+          <w:szCs w:val="21"/>
+        </w:rPr>
+        <w:t xml:space="preserve">震惊+质疑，带点夸张的“抓包”喜剧感</w:t>
+      </w:r>
+    </w:p>
+    <w:p>
+      <w:pPr>
+        <w:spacing w:after="40"/>
+        <w:ind w:left="360"/>
+      </w:pPr>
+      <w:r>
+        <w:rPr>
+          <w:b/>
+          <w:bCs/>
+          <w:color w:val="1F5FA8"/>
+          <w:sz w:val="21"/>
+          <w:szCs w:val="21"/>
+        </w:rPr>
+        <w:t xml:space="preserve">重音词：</w:t>
+      </w:r>
+      <w:r>
+        <w:rPr>
+          <w:color w:val="1F5FA8"/>
+          <w:sz w:val="21"/>
+          <w:szCs w:val="21"/>
+        </w:rPr>
+        <w:t xml:space="preserve">同样是投资 / 三成 / 全资 / 一分不记</w:t>
+      </w:r>
+    </w:p>
+    <w:p>
+      <w:pPr>
+        <w:spacing w:after="280"/>
+        <w:ind w:left="360"/>
+      </w:pPr>
+      <w:r>
+        <w:rPr>
+          <w:b/>
+          <w:bCs/>
+          <w:color w:val="1E7A46"/>
+          <w:sz w:val="21"/>
+          <w:szCs w:val="21"/>
+        </w:rPr>
+        <w:t xml:space="preserve">咬字/节奏提示：</w:t>
+      </w:r>
+      <w:r>
+        <w:rPr>
+          <w:color w:val="1E7A46"/>
+          <w:sz w:val="21"/>
+          <w:szCs w:val="21"/>
+        </w:rPr>
+        <w:t xml:space="preserve">语速偏快，“三成”“全资”“三万元”“五万元”几个数字词必须咬字清楚，这是这句话的信息核心，不能含糊带过</w:t>
+      </w:r>
+    </w:p>
+    <w:p>
+      <w:pPr>
+        <w:spacing w:after="60" w:before="200"/>
       </w:pPr>
       <w:r>
         <w:rPr>
@@ -349,7 +853,7 @@
     </w:p>
     <w:p>
       <w:pPr>
-        <w:spacing w:after="280"/>
+        <w:spacing w:after="80"/>
         <w:ind w:left="360"/>
       </w:pPr>
       <w:r>
@@ -362,7 +866,79 @@
     </w:p>
     <w:p>
       <w:pPr>
-        <w:spacing w:after="60"/>
+        <w:spacing w:after="40"/>
+        <w:ind w:left="360"/>
+      </w:pPr>
+      <w:r>
+        <w:rPr>
+          <w:b/>
+          <w:bCs/>
+          <w:color w:val="B05A00"/>
+          <w:sz w:val="21"/>
+          <w:szCs w:val="21"/>
+        </w:rPr>
+        <w:t xml:space="preserve">情绪基调：</w:t>
+      </w:r>
+      <w:r>
+        <w:rPr>
+          <w:color w:val="B05A00"/>
+          <w:sz w:val="21"/>
+          <w:szCs w:val="21"/>
+        </w:rPr>
+        <w:t xml:space="preserve">夸张愤怒中带点委屈，喜剧化处理，不要真凶</w:t>
+      </w:r>
+    </w:p>
+    <w:p>
+      <w:pPr>
+        <w:spacing w:after="40"/>
+        <w:ind w:left="360"/>
+      </w:pPr>
+      <w:r>
+        <w:rPr>
+          <w:b/>
+          <w:bCs/>
+          <w:color w:val="1F5FA8"/>
+          <w:sz w:val="21"/>
+          <w:szCs w:val="21"/>
+        </w:rPr>
+        <w:t xml:space="preserve">重音词：</w:t>
+      </w:r>
+      <w:r>
+        <w:rPr>
+          <w:color w:val="1F5FA8"/>
+          <w:sz w:val="21"/>
+          <w:szCs w:val="21"/>
+        </w:rPr>
+        <w:t xml:space="preserve">本末倒置 / 藏私房钱</w:t>
+      </w:r>
+    </w:p>
+    <w:p>
+      <w:pPr>
+        <w:spacing w:after="280"/>
+        <w:ind w:left="360"/>
+      </w:pPr>
+      <w:r>
+        <w:rPr>
+          <w:b/>
+          <w:bCs/>
+          <w:color w:val="1E7A46"/>
+          <w:sz w:val="21"/>
+          <w:szCs w:val="21"/>
+        </w:rPr>
+        <w:t xml:space="preserve">咬字/节奏提示：</w:t>
+      </w:r>
+      <w:r>
+        <w:rPr>
+          <w:color w:val="1E7A46"/>
+          <w:sz w:val="21"/>
+          <w:szCs w:val="21"/>
+        </w:rPr>
+        <w:t xml:space="preserve">尾音上扬、略带重音收尾，制造喜剧效果</w:t>
+      </w:r>
+    </w:p>
+    <w:p>
+      <w:pPr>
+        <w:spacing w:after="60" w:before="200"/>
       </w:pPr>
       <w:r>
         <w:rPr>
@@ -386,7 +962,7 @@
     </w:p>
     <w:p>
       <w:pPr>
-        <w:spacing w:after="280"/>
+        <w:spacing w:after="80"/>
         <w:ind w:left="360"/>
       </w:pPr>
       <w:r>
@@ -399,7 +975,79 @@
     </w:p>
     <w:p>
       <w:pPr>
-        <w:spacing w:after="60"/>
+        <w:spacing w:after="40"/>
+        <w:ind w:left="360"/>
+      </w:pPr>
+      <w:r>
+        <w:rPr>
+          <w:b/>
+          <w:bCs/>
+          <w:color w:val="B05A00"/>
+          <w:sz w:val="21"/>
+          <w:szCs w:val="21"/>
+        </w:rPr>
+        <w:t xml:space="preserve">情绪基调：</w:t>
+      </w:r>
+      <w:r>
+        <w:rPr>
+          <w:color w:val="B05A00"/>
+          <w:sz w:val="21"/>
+          <w:szCs w:val="21"/>
+        </w:rPr>
+        <w:t xml:space="preserve">崩溃无奈中带点好笑的暴躁</w:t>
+      </w:r>
+    </w:p>
+    <w:p>
+      <w:pPr>
+        <w:spacing w:after="40"/>
+        <w:ind w:left="360"/>
+      </w:pPr>
+      <w:r>
+        <w:rPr>
+          <w:b/>
+          <w:bCs/>
+          <w:color w:val="1F5FA8"/>
+          <w:sz w:val="21"/>
+          <w:szCs w:val="21"/>
+        </w:rPr>
+        <w:t xml:space="preserve">重音词：</w:t>
+      </w:r>
+      <w:r>
+        <w:rPr>
+          <w:color w:val="1F5FA8"/>
+          <w:sz w:val="21"/>
+          <w:szCs w:val="21"/>
+        </w:rPr>
+        <w:t xml:space="preserve">添乱 / 说清楚</w:t>
+      </w:r>
+    </w:p>
+    <w:p>
+      <w:pPr>
+        <w:spacing w:after="280"/>
+        <w:ind w:left="360"/>
+      </w:pPr>
+      <w:r>
+        <w:rPr>
+          <w:b/>
+          <w:bCs/>
+          <w:color w:val="1E7A46"/>
+          <w:sz w:val="21"/>
+          <w:szCs w:val="21"/>
+        </w:rPr>
+        <w:t xml:space="preserve">咬字/节奏提示：</w:t>
+      </w:r>
+      <w:r>
+        <w:rPr>
+          <w:color w:val="1E7A46"/>
+          <w:sz w:val="21"/>
+          <w:szCs w:val="21"/>
+        </w:rPr>
+        <w:t xml:space="preserve">两句之间要有明显停顿，语气短促有力</w:t>
+      </w:r>
+    </w:p>
+    <w:p>
+      <w:pPr>
+        <w:spacing w:after="60" w:before="200"/>
       </w:pPr>
       <w:r>
         <w:rPr>
@@ -423,7 +1071,7 @@
     </w:p>
     <w:p>
       <w:pPr>
-        <w:spacing w:after="280"/>
+        <w:spacing w:after="80"/>
         <w:ind w:left="360"/>
       </w:pPr>
       <w:r>
@@ -436,7 +1084,79 @@
     </w:p>
     <w:p>
       <w:pPr>
-        <w:spacing w:after="60"/>
+        <w:spacing w:after="40"/>
+        <w:ind w:left="360"/>
+      </w:pPr>
+      <w:r>
+        <w:rPr>
+          <w:b/>
+          <w:bCs/>
+          <w:color w:val="B05A00"/>
+          <w:sz w:val="21"/>
+          <w:szCs w:val="21"/>
+        </w:rPr>
+        <w:t xml:space="preserve">情绪基调：</w:t>
+      </w:r>
+      <w:r>
+        <w:rPr>
+          <w:color w:val="B05A00"/>
+          <w:sz w:val="21"/>
+          <w:szCs w:val="21"/>
+        </w:rPr>
+        <w:t xml:space="preserve">似懂非懂，带疑惑</w:t>
+      </w:r>
+    </w:p>
+    <w:p>
+      <w:pPr>
+        <w:spacing w:after="40"/>
+        <w:ind w:left="360"/>
+      </w:pPr>
+      <w:r>
+        <w:rPr>
+          <w:b/>
+          <w:bCs/>
+          <w:color w:val="1F5FA8"/>
+          <w:sz w:val="21"/>
+          <w:szCs w:val="21"/>
+        </w:rPr>
+        <w:t xml:space="preserve">重音词：</w:t>
+      </w:r>
+      <w:r>
+        <w:rPr>
+          <w:color w:val="1F5FA8"/>
+          <w:sz w:val="21"/>
+          <w:szCs w:val="21"/>
+        </w:rPr>
+        <w:t xml:space="preserve">所以</w:t>
+      </w:r>
+    </w:p>
+    <w:p>
+      <w:pPr>
+        <w:spacing w:after="280"/>
+        <w:ind w:left="360"/>
+      </w:pPr>
+      <w:r>
+        <w:rPr>
+          <w:b/>
+          <w:bCs/>
+          <w:color w:val="1E7A46"/>
+          <w:sz w:val="21"/>
+          <w:szCs w:val="21"/>
+        </w:rPr>
+        <w:t xml:space="preserve">咬字/节奏提示：</w:t>
+      </w:r>
+      <w:r>
+        <w:rPr>
+          <w:color w:val="1E7A46"/>
+          <w:sz w:val="21"/>
+          <w:szCs w:val="21"/>
+        </w:rPr>
+        <w:t xml:space="preserve">语气上扬，像是没听懂在追问</w:t>
+      </w:r>
+    </w:p>
+    <w:p>
+      <w:pPr>
+        <w:spacing w:after="60" w:before="200"/>
       </w:pPr>
       <w:r>
         <w:rPr>
@@ -460,7 +1180,7 @@
     </w:p>
     <w:p>
       <w:pPr>
-        <w:spacing w:after="280"/>
+        <w:spacing w:after="80"/>
         <w:ind w:left="360"/>
       </w:pPr>
       <w:r>
@@ -473,7 +1193,79 @@
     </w:p>
     <w:p>
       <w:pPr>
-        <w:spacing w:after="60"/>
+        <w:spacing w:after="40"/>
+        <w:ind w:left="360"/>
+      </w:pPr>
+      <w:r>
+        <w:rPr>
+          <w:b/>
+          <w:bCs/>
+          <w:color w:val="B05A00"/>
+          <w:sz w:val="21"/>
+          <w:szCs w:val="21"/>
+        </w:rPr>
+        <w:t xml:space="preserve">情绪基调：</w:t>
+      </w:r>
+      <w:r>
+        <w:rPr>
+          <w:color w:val="B05A00"/>
+          <w:sz w:val="21"/>
+          <w:szCs w:val="21"/>
+        </w:rPr>
+        <w:t xml:space="preserve">恍然大悟，带疑问语气，像自己给自己确认</w:t>
+      </w:r>
+    </w:p>
+    <w:p>
+      <w:pPr>
+        <w:spacing w:after="40"/>
+        <w:ind w:left="360"/>
+      </w:pPr>
+      <w:r>
+        <w:rPr>
+          <w:b/>
+          <w:bCs/>
+          <w:color w:val="1F5FA8"/>
+          <w:sz w:val="21"/>
+          <w:szCs w:val="21"/>
+        </w:rPr>
+        <w:t xml:space="preserve">重音词：</w:t>
+      </w:r>
+      <w:r>
+        <w:rPr>
+          <w:color w:val="1F5FA8"/>
+          <w:sz w:val="21"/>
+          <w:szCs w:val="21"/>
+        </w:rPr>
+        <w:t xml:space="preserve">能做主 / 做不了主 / 反而（两次都要咬清楚）</w:t>
+      </w:r>
+    </w:p>
+    <w:p>
+      <w:pPr>
+        <w:spacing w:after="280"/>
+        <w:ind w:left="360"/>
+      </w:pPr>
+      <w:r>
+        <w:rPr>
+          <w:b/>
+          <w:bCs/>
+          <w:color w:val="1E7A46"/>
+          <w:sz w:val="21"/>
+          <w:szCs w:val="21"/>
+        </w:rPr>
+        <w:t xml:space="preserve">咬字/节奏提示：</w:t>
+      </w:r>
+      <w:r>
+        <w:rPr>
+          <w:color w:val="1E7A46"/>
+          <w:sz w:val="21"/>
+          <w:szCs w:val="21"/>
+        </w:rPr>
+        <w:t xml:space="preserve">语速比平时稍慢，带思考感；“反而”是理解反直觉逻辑的关键连接词，务必清楚</w:t>
+      </w:r>
+    </w:p>
+    <w:p>
+      <w:pPr>
+        <w:spacing w:after="60" w:before="200"/>
       </w:pPr>
       <w:r>
         <w:rPr>
@@ -497,7 +1289,7 @@
     </w:p>
     <w:p>
       <w:pPr>
-        <w:spacing w:after="280"/>
+        <w:spacing w:after="80"/>
         <w:ind w:left="360"/>
       </w:pPr>
       <w:r>
@@ -510,6 +1302,78 @@
     </w:p>
     <w:p>
       <w:pPr>
+        <w:spacing w:after="40"/>
+        <w:ind w:left="360"/>
+      </w:pPr>
+      <w:r>
+        <w:rPr>
+          <w:b/>
+          <w:bCs/>
+          <w:color w:val="B05A00"/>
+          <w:sz w:val="21"/>
+          <w:szCs w:val="21"/>
+        </w:rPr>
+        <w:t xml:space="preserve">情绪基调：</w:t>
+      </w:r>
+      <w:r>
+        <w:rPr>
+          <w:color w:val="B05A00"/>
+          <w:sz w:val="21"/>
+          <w:szCs w:val="21"/>
+        </w:rPr>
+        <w:t xml:space="preserve">惊讶中带期待，喜剧悬念感</w:t>
+      </w:r>
+    </w:p>
+    <w:p>
+      <w:pPr>
+        <w:spacing w:after="40"/>
+        <w:ind w:left="360"/>
+      </w:pPr>
+      <w:r>
+        <w:rPr>
+          <w:b/>
+          <w:bCs/>
+          <w:color w:val="1F5FA8"/>
+          <w:sz w:val="21"/>
+          <w:szCs w:val="21"/>
+        </w:rPr>
+        <w:t xml:space="preserve">重音词：</w:t>
+      </w:r>
+      <w:r>
+        <w:rPr>
+          <w:color w:val="1F5FA8"/>
+          <w:sz w:val="21"/>
+          <w:szCs w:val="21"/>
+        </w:rPr>
+        <w:t xml:space="preserve">自己说了算 / 也要变</w:t>
+      </w:r>
+    </w:p>
+    <w:p>
+      <w:pPr>
+        <w:spacing w:after="280"/>
+        <w:ind w:left="360"/>
+      </w:pPr>
+      <w:r>
+        <w:rPr>
+          <w:b/>
+          <w:bCs/>
+          <w:color w:val="1E7A46"/>
+          <w:sz w:val="21"/>
+          <w:szCs w:val="21"/>
+        </w:rPr>
+        <w:t xml:space="preserve">咬字/节奏提示：</w:t>
+      </w:r>
+      <w:r>
+        <w:rPr>
+          <w:color w:val="1E7A46"/>
+          <w:sz w:val="21"/>
+          <w:szCs w:val="21"/>
+        </w:rPr>
+        <w:t xml:space="preserve">尾音上扬，制造追更悬念</w:t>
+      </w:r>
+    </w:p>
+    <w:p>
+      <w:pPr>
         <w:pStyle w:val="Heading1"/>
         <w:spacing w:after="200" w:before="400"/>
       </w:pPr>
@@ -525,7 +1389,7 @@
     </w:p>
     <w:p>
       <w:pPr>
-        <w:spacing w:after="60"/>
+        <w:spacing w:after="60" w:before="200"/>
       </w:pPr>
       <w:r>
         <w:rPr>
@@ -549,7 +1413,7 @@
     </w:p>
     <w:p>
       <w:pPr>
-        <w:spacing w:after="280"/>
+        <w:spacing w:after="80"/>
         <w:ind w:left="360"/>
       </w:pPr>
       <w:r>
@@ -562,7 +1426,79 @@
     </w:p>
     <w:p>
       <w:pPr>
-        <w:spacing w:after="60"/>
+        <w:spacing w:after="40"/>
+        <w:ind w:left="360"/>
+      </w:pPr>
+      <w:r>
+        <w:rPr>
+          <w:b/>
+          <w:bCs/>
+          <w:color w:val="B05A00"/>
+          <w:sz w:val="21"/>
+          <w:szCs w:val="21"/>
+        </w:rPr>
+        <w:t xml:space="preserve">情绪基调：</w:t>
+      </w:r>
+      <w:r>
+        <w:rPr>
+          <w:color w:val="B05A00"/>
+          <w:sz w:val="21"/>
+          <w:szCs w:val="21"/>
+        </w:rPr>
+        <w:t xml:space="preserve">天真无邪，带点调皮，完全没意识到自己在拱火</w:t>
+      </w:r>
+    </w:p>
+    <w:p>
+      <w:pPr>
+        <w:spacing w:after="40"/>
+        <w:ind w:left="360"/>
+      </w:pPr>
+      <w:r>
+        <w:rPr>
+          <w:b/>
+          <w:bCs/>
+          <w:color w:val="1F5FA8"/>
+          <w:sz w:val="21"/>
+          <w:szCs w:val="21"/>
+        </w:rPr>
+        <w:t xml:space="preserve">重音词：</w:t>
+      </w:r>
+      <w:r>
+        <w:rPr>
+          <w:color w:val="1F5FA8"/>
+          <w:sz w:val="21"/>
+          <w:szCs w:val="21"/>
+        </w:rPr>
+        <w:t xml:space="preserve">私房钱</w:t>
+      </w:r>
+    </w:p>
+    <w:p>
+      <w:pPr>
+        <w:spacing w:after="280"/>
+        <w:ind w:left="360"/>
+      </w:pPr>
+      <w:r>
+        <w:rPr>
+          <w:b/>
+          <w:bCs/>
+          <w:color w:val="1E7A46"/>
+          <w:sz w:val="21"/>
+          <w:szCs w:val="21"/>
+        </w:rPr>
+        <w:t xml:space="preserve">咬字/节奏提示：</w:t>
+      </w:r>
+      <w:r>
+        <w:rPr>
+          <w:color w:val="1E7A46"/>
+          <w:sz w:val="21"/>
+          <w:szCs w:val="21"/>
+        </w:rPr>
+        <w:t xml:space="preserve">语速偏慢，孩子气咬字，“私房钱”三字可以略拖长带俏皮感</w:t>
+      </w:r>
+    </w:p>
+    <w:p>
+      <w:pPr>
+        <w:spacing w:after="60" w:before="200"/>
       </w:pPr>
       <w:r>
         <w:rPr>
@@ -586,7 +1522,7 @@
     </w:p>
     <w:p>
       <w:pPr>
-        <w:spacing w:after="280"/>
+        <w:spacing w:after="80"/>
         <w:ind w:left="360"/>
       </w:pPr>
       <w:r>
@@ -599,7 +1535,79 @@
     </w:p>
     <w:p>
       <w:pPr>
-        <w:spacing w:after="60"/>
+        <w:spacing w:after="40"/>
+        <w:ind w:left="360"/>
+      </w:pPr>
+      <w:r>
+        <w:rPr>
+          <w:b/>
+          <w:bCs/>
+          <w:color w:val="B05A00"/>
+          <w:sz w:val="21"/>
+          <w:szCs w:val="21"/>
+        </w:rPr>
+        <w:t xml:space="preserve">情绪基调：</w:t>
+      </w:r>
+      <w:r>
+        <w:rPr>
+          <w:color w:val="B05A00"/>
+          <w:sz w:val="21"/>
+          <w:szCs w:val="21"/>
+        </w:rPr>
+        <w:t xml:space="preserve">兴奋、恍然大悟，孩子式的得意</w:t>
+      </w:r>
+    </w:p>
+    <w:p>
+      <w:pPr>
+        <w:spacing w:after="40"/>
+        <w:ind w:left="360"/>
+      </w:pPr>
+      <w:r>
+        <w:rPr>
+          <w:b/>
+          <w:bCs/>
+          <w:color w:val="1F5FA8"/>
+          <w:sz w:val="21"/>
+          <w:szCs w:val="21"/>
+        </w:rPr>
+        <w:t xml:space="preserve">重音词：</w:t>
+      </w:r>
+      <w:r>
+        <w:rPr>
+          <w:color w:val="1F5FA8"/>
+          <w:sz w:val="21"/>
+          <w:szCs w:val="21"/>
+        </w:rPr>
+        <w:t xml:space="preserve">股东但当不了家 / 自己当家做主</w:t>
+      </w:r>
+    </w:p>
+    <w:p>
+      <w:pPr>
+        <w:spacing w:after="280"/>
+        <w:ind w:left="360"/>
+      </w:pPr>
+      <w:r>
+        <w:rPr>
+          <w:b/>
+          <w:bCs/>
+          <w:color w:val="1E7A46"/>
+          <w:sz w:val="21"/>
+          <w:szCs w:val="21"/>
+        </w:rPr>
+        <w:t xml:space="preserve">咬字/节奏提示：</w:t>
+      </w:r>
+      <w:r>
+        <w:rPr>
+          <w:color w:val="1E7A46"/>
+          <w:sz w:val="21"/>
+          <w:szCs w:val="21"/>
+        </w:rPr>
+        <w:t xml:space="preserve">这是全片的“金句总结”，两个短语要用不同语调区分强调，形成对比记忆点；语速比小男孩平时台词稍慢，确保这句“梗”听得清楚</w:t>
+      </w:r>
+    </w:p>
+    <w:p>
+      <w:pPr>
+        <w:spacing w:after="60" w:before="200"/>
       </w:pPr>
       <w:r>
         <w:rPr>
@@ -623,7 +1631,7 @@
     </w:p>
     <w:p>
       <w:pPr>
-        <w:spacing w:after="280"/>
+        <w:spacing w:after="80"/>
         <w:ind w:left="360"/>
       </w:pPr>
       <w:r>
@@ -636,6 +1644,78 @@
     </w:p>
     <w:p>
       <w:pPr>
+        <w:spacing w:after="40"/>
+        <w:ind w:left="360"/>
+      </w:pPr>
+      <w:r>
+        <w:rPr>
+          <w:b/>
+          <w:bCs/>
+          <w:color w:val="B05A00"/>
+          <w:sz w:val="21"/>
+          <w:szCs w:val="21"/>
+        </w:rPr>
+        <w:t xml:space="preserve">情绪基调：</w:t>
+      </w:r>
+      <w:r>
+        <w:rPr>
+          <w:color w:val="B05A00"/>
+          <w:sz w:val="21"/>
+          <w:szCs w:val="21"/>
+        </w:rPr>
+        <w:t xml:space="preserve">调皮看好戏</w:t>
+      </w:r>
+    </w:p>
+    <w:p>
+      <w:pPr>
+        <w:spacing w:after="40"/>
+        <w:ind w:left="360"/>
+      </w:pPr>
+      <w:r>
+        <w:rPr>
+          <w:b/>
+          <w:bCs/>
+          <w:color w:val="1F5FA8"/>
+          <w:sz w:val="21"/>
+          <w:szCs w:val="21"/>
+        </w:rPr>
+        <w:t xml:space="preserve">重音词：</w:t>
+      </w:r>
+      <w:r>
+        <w:rPr>
+          <w:color w:val="1F5FA8"/>
+          <w:sz w:val="21"/>
+          <w:szCs w:val="21"/>
+        </w:rPr>
+        <w:t xml:space="preserve">变身</w:t>
+      </w:r>
+    </w:p>
+    <w:p>
+      <w:pPr>
+        <w:spacing w:after="280"/>
+        <w:ind w:left="360"/>
+      </w:pPr>
+      <w:r>
+        <w:rPr>
+          <w:b/>
+          <w:bCs/>
+          <w:color w:val="1E7A46"/>
+          <w:sz w:val="21"/>
+          <w:szCs w:val="21"/>
+        </w:rPr>
+        <w:t xml:space="preserve">咬字/节奏提示：</w:t>
+      </w:r>
+      <w:r>
+        <w:rPr>
+          <w:color w:val="1E7A46"/>
+          <w:sz w:val="21"/>
+          <w:szCs w:val="21"/>
+        </w:rPr>
+        <w:t xml:space="preserve">整体轻快语气，尾音“喽~”上扬拖长，带俏皮感</w:t>
+      </w:r>
+    </w:p>
+    <w:p>
+      <w:pPr>
         <w:pStyle w:val="Heading1"/>
         <w:spacing w:after="200" w:before="400"/>
       </w:pPr>
@@ -646,12 +1726,12 @@
           <w:sz w:val="32"/>
           <w:szCs w:val="32"/>
         </w:rPr>
-        <w:t xml:space="preserve">【旁白/字幕（非角色台词，屏幕文字）】</w:t>
-      </w:r>
-    </w:p>
-    <w:p>
-      <w:pPr>
-        <w:spacing w:after="60"/>
+        <w:t xml:space="preserve">【旁白/字幕（非角色台词，屏幕文字，可选是否配音朗读）】</w:t>
+      </w:r>
+    </w:p>
+    <w:p>
+      <w:pPr>
+        <w:spacing w:after="60" w:before="200"/>
       </w:pPr>
       <w:r>
         <w:rPr>
@@ -675,7 +1755,7 @@
     </w:p>
     <w:p>
       <w:pPr>
-        <w:spacing w:after="280"/>
+        <w:spacing w:after="80"/>
         <w:ind w:left="360"/>
       </w:pPr>
       <w:r>
@@ -688,7 +1768,15 @@
     </w:p>
     <w:p>
       <w:pPr>
-        <w:spacing w:after="60"/>
+        <w:spacing w:after="240"/>
+      </w:pPr>
+      <w:r>
+        <w:t xml:space="preserve"/>
+      </w:r>
+    </w:p>
+    <w:p>
+      <w:pPr>
+        <w:spacing w:after="60" w:before="200"/>
       </w:pPr>
       <w:r>
         <w:rPr>
@@ -712,7 +1800,7 @@
     </w:p>
     <w:p>
       <w:pPr>
-        <w:spacing w:after="280"/>
+        <w:spacing w:after="80"/>
         <w:ind w:left="360"/>
       </w:pPr>
       <w:r>
@@ -725,7 +1813,15 @@
     </w:p>
     <w:p>
       <w:pPr>
-        <w:spacing w:after="60"/>
+        <w:spacing w:after="240"/>
+      </w:pPr>
+      <w:r>
+        <w:t xml:space="preserve"/>
+      </w:r>
+    </w:p>
+    <w:p>
+      <w:pPr>
+        <w:spacing w:after="60" w:before="200"/>
       </w:pPr>
       <w:r>
         <w:rPr>
@@ -749,7 +1845,7 @@
     </w:p>
     <w:p>
       <w:pPr>
-        <w:spacing w:after="280"/>
+        <w:spacing w:after="80"/>
         <w:ind w:left="360"/>
       </w:pPr>
       <w:r>
@@ -758,6 +1854,14 @@
           <w:szCs w:val="26"/>
         </w:rPr>
         <w:t xml:space="preserve">下一集：一旦“说了算”变成“说了不算”，便当店的账该怎么从成本法变成权益法？</w:t>
+      </w:r>
+    </w:p>
+    <w:p>
+      <w:pPr>
+        <w:spacing w:after="240"/>
+      </w:pPr>
+      <w:r>
+        <w:t xml:space="preserve"/>
       </w:r>
     </w:p>
     <w:sectPr>

</xml_diff>